<commit_message>
Mostrar aviso antes de cada descarga TXT
</commit_message>
<xml_diff>
--- a/output/docx/Manual_de_usuario_TOPORAY_v1.0.docx
+++ b/output/docx/Manual_de_usuario_TOPORAY_v1.0.docx
@@ -23,7 +23,7 @@
           <w:noProof/>
         </w:rPr>
         <w:drawing>
-          <wp:inline distT="0" distB="0" distL="0" distR="0" wp14:anchorId="18CDAEC5" wp14:editId="25B672F1">
+          <wp:inline distT="0" distB="0" distL="0" distR="0" wp14:anchorId="3858F761" wp14:editId="481703DA">
             <wp:extent cx="3780000" cy="864000"/>
             <wp:effectExtent l="0" t="0" r="0" b="0"/>
             <wp:docPr id="1" name="Picture 1" descr="Logotipo institucional de TOPORAY." title="Logotipo institucional de TOPORAY."/>
@@ -234,7 +234,7 @@
               </w:rPr>
             </w:pPr>
             <w:r>
-              <w:t>1.3</w:t>
+              <w:t>1.4</w:t>
             </w:r>
           </w:p>
         </w:tc>
@@ -981,6 +981,96 @@
               </w:rPr>
             </w:pPr>
             <w:r>
+              <w:t>Histórico</w:t>
+            </w:r>
+          </w:p>
+        </w:tc>
+      </w:tr>
+      <w:tr>
+        <w:tc>
+          <w:tcPr>
+            <w:tcW w:w="1247" w:type="dxa"/>
+            <w:tcMar>
+              <w:top w:w="90" w:type="dxa"/>
+              <w:left w:w="110" w:type="dxa"/>
+              <w:bottom w:w="90" w:type="dxa"/>
+              <w:right w:w="110" w:type="dxa"/>
+            </w:tcMar>
+          </w:tcPr>
+          <w:p>
+            <w:pPr>
+              <w:pStyle w:val="TableBody"/>
+              <w:rPr>
+                <w:rFonts w:hint="eastAsia"/>
+              </w:rPr>
+            </w:pPr>
+            <w:r>
+              <w:t>1.4</w:t>
+            </w:r>
+          </w:p>
+        </w:tc>
+        <w:tc>
+          <w:tcPr>
+            <w:tcW w:w="1701" w:type="dxa"/>
+            <w:tcMar>
+              <w:top w:w="90" w:type="dxa"/>
+              <w:left w:w="110" w:type="dxa"/>
+              <w:bottom w:w="90" w:type="dxa"/>
+              <w:right w:w="110" w:type="dxa"/>
+            </w:tcMar>
+          </w:tcPr>
+          <w:p>
+            <w:pPr>
+              <w:pStyle w:val="TableBody"/>
+              <w:rPr>
+                <w:rFonts w:hint="eastAsia"/>
+              </w:rPr>
+            </w:pPr>
+            <w:r>
+              <w:t>15/09/2026</w:t>
+            </w:r>
+          </w:p>
+        </w:tc>
+        <w:tc>
+          <w:tcPr>
+            <w:tcW w:w="5216" w:type="dxa"/>
+            <w:tcMar>
+              <w:top w:w="90" w:type="dxa"/>
+              <w:left w:w="110" w:type="dxa"/>
+              <w:bottom w:w="90" w:type="dxa"/>
+              <w:right w:w="110" w:type="dxa"/>
+            </w:tcMar>
+          </w:tcPr>
+          <w:p>
+            <w:pPr>
+              <w:pStyle w:val="TableBody"/>
+              <w:rPr>
+                <w:rFonts w:hint="eastAsia"/>
+              </w:rPr>
+            </w:pPr>
+            <w:r>
+              <w:t>Aviso obligatorio antes de cada descarga de coordenadas TXT</w:t>
+            </w:r>
+          </w:p>
+        </w:tc>
+        <w:tc>
+          <w:tcPr>
+            <w:tcW w:w="1587" w:type="dxa"/>
+            <w:tcMar>
+              <w:top w:w="90" w:type="dxa"/>
+              <w:left w:w="110" w:type="dxa"/>
+              <w:bottom w:w="90" w:type="dxa"/>
+              <w:right w:w="110" w:type="dxa"/>
+            </w:tcMar>
+          </w:tcPr>
+          <w:p>
+            <w:pPr>
+              <w:pStyle w:val="TableBody"/>
+              <w:rPr>
+                <w:rFonts w:hint="eastAsia"/>
+              </w:rPr>
+            </w:pPr>
+            <w:r>
               <w:t>Vigente</w:t>
             </w:r>
           </w:p>
@@ -1043,7 +1133,7 @@
       <w:r>
         <w:fldChar w:fldCharType="separate"/>
       </w:r>
-      <w:hyperlink w:anchor="_Toc240369589" w:history="1">
+      <w:hyperlink w:anchor="_Toc240391965" w:history="1">
         <w:r>
           <w:rPr>
             <w:rStyle w:val="Hipervnculo"/>
@@ -1070,7 +1160,7 @@
             <w:noProof/>
             <w:webHidden/>
           </w:rPr>
-          <w:instrText xml:space="preserve"> PAGEREF _Toc240369589 \h </w:instrText>
+          <w:instrText xml:space="preserve"> PAGEREF _Toc240391965 \h </w:instrText>
         </w:r>
         <w:r>
           <w:rPr>
@@ -1118,7 +1208,7 @@
           <w14:ligatures w14:val="standardContextual"/>
         </w:rPr>
       </w:pPr>
-      <w:hyperlink w:anchor="_Toc240369590" w:history="1">
+      <w:hyperlink w:anchor="_Toc240391966" w:history="1">
         <w:r>
           <w:rPr>
             <w:rStyle w:val="Hipervnculo"/>
@@ -1145,7 +1235,7 @@
             <w:noProof/>
             <w:webHidden/>
           </w:rPr>
-          <w:instrText xml:space="preserve"> PAGEREF _Toc240369590 \h </w:instrText>
+          <w:instrText xml:space="preserve"> PAGEREF _Toc240391966 \h </w:instrText>
         </w:r>
         <w:r>
           <w:rPr>
@@ -1193,7 +1283,7 @@
           <w14:ligatures w14:val="standardContextual"/>
         </w:rPr>
       </w:pPr>
-      <w:hyperlink w:anchor="_Toc240369591" w:history="1">
+      <w:hyperlink w:anchor="_Toc240391967" w:history="1">
         <w:r>
           <w:rPr>
             <w:rStyle w:val="Hipervnculo"/>
@@ -1220,7 +1310,7 @@
             <w:noProof/>
             <w:webHidden/>
           </w:rPr>
-          <w:instrText xml:space="preserve"> PAGEREF _Toc240369591 \h </w:instrText>
+          <w:instrText xml:space="preserve"> PAGEREF _Toc240391967 \h </w:instrText>
         </w:r>
         <w:r>
           <w:rPr>
@@ -1268,7 +1358,7 @@
           <w14:ligatures w14:val="standardContextual"/>
         </w:rPr>
       </w:pPr>
-      <w:hyperlink w:anchor="_Toc240369592" w:history="1">
+      <w:hyperlink w:anchor="_Toc240391968" w:history="1">
         <w:r>
           <w:rPr>
             <w:rStyle w:val="Hipervnculo"/>
@@ -1295,82 +1385,7 @@
             <w:noProof/>
             <w:webHidden/>
           </w:rPr>
-          <w:instrText xml:space="preserve"> PAGEREF _Toc240369592 \h </w:instrText>
-        </w:r>
-        <w:r>
-          <w:rPr>
-            <w:noProof/>
-            <w:webHidden/>
-          </w:rPr>
-        </w:r>
-        <w:r>
-          <w:rPr>
-            <w:noProof/>
-            <w:webHidden/>
-          </w:rPr>
-          <w:fldChar w:fldCharType="separate"/>
-        </w:r>
-        <w:r>
-          <w:rPr>
-            <w:noProof/>
-            <w:webHidden/>
-          </w:rPr>
-          <w:t>6</w:t>
-        </w:r>
-        <w:r>
-          <w:rPr>
-            <w:noProof/>
-            <w:webHidden/>
-          </w:rPr>
-          <w:fldChar w:fldCharType="end"/>
-        </w:r>
-      </w:hyperlink>
-    </w:p>
-    <w:p>
-      <w:pPr>
-        <w:pStyle w:val="TDC1"/>
-        <w:tabs>
-          <w:tab w:val="right" w:leader="dot" w:pos="10190"/>
-        </w:tabs>
-        <w:rPr>
-          <w:rFonts w:asciiTheme="minorHAnsi" w:hAnsiTheme="minorHAnsi"/>
-          <w:noProof/>
-          <w:color w:val="auto"/>
-          <w:kern w:val="2"/>
-          <w:sz w:val="24"/>
-          <w:szCs w:val="24"/>
-          <w:lang w:val="es-CO" w:eastAsia="es-CO"/>
-          <w14:ligatures w14:val="standardContextual"/>
-        </w:rPr>
-      </w:pPr>
-      <w:hyperlink w:anchor="_Toc240369593" w:history="1">
-        <w:r>
-          <w:rPr>
-            <w:rStyle w:val="Hipervnculo"/>
-            <w:noProof/>
-          </w:rPr>
-          <w:t>5. Zonas: crear y administrar objetos</w:t>
-        </w:r>
-        <w:r>
-          <w:rPr>
-            <w:noProof/>
-            <w:webHidden/>
-          </w:rPr>
-          <w:tab/>
-        </w:r>
-        <w:r>
-          <w:rPr>
-            <w:noProof/>
-            <w:webHidden/>
-          </w:rPr>
-          <w:fldChar w:fldCharType="begin"/>
-        </w:r>
-        <w:r>
-          <w:rPr>
-            <w:noProof/>
-            <w:webHidden/>
-          </w:rPr>
-          <w:instrText xml:space="preserve"> PAGEREF _Toc240369593 \h </w:instrText>
+          <w:instrText xml:space="preserve"> PAGEREF _Toc240391968 \h </w:instrText>
         </w:r>
         <w:r>
           <w:rPr>
@@ -1418,13 +1433,13 @@
           <w14:ligatures w14:val="standardContextual"/>
         </w:rPr>
       </w:pPr>
-      <w:hyperlink w:anchor="_Toc240369594" w:history="1">
+      <w:hyperlink w:anchor="_Toc240391969" w:history="1">
         <w:r>
           <w:rPr>
             <w:rStyle w:val="Hipervnculo"/>
             <w:noProof/>
           </w:rPr>
-          <w:t>6. Puntos: registrar, editar y validar</w:t>
+          <w:t>5. Zonas: crear y administrar objetos</w:t>
         </w:r>
         <w:r>
           <w:rPr>
@@ -1445,7 +1460,7 @@
             <w:noProof/>
             <w:webHidden/>
           </w:rPr>
-          <w:instrText xml:space="preserve"> PAGEREF _Toc240369594 \h </w:instrText>
+          <w:instrText xml:space="preserve"> PAGEREF _Toc240391969 \h </w:instrText>
         </w:r>
         <w:r>
           <w:rPr>
@@ -1493,13 +1508,13 @@
           <w14:ligatures w14:val="standardContextual"/>
         </w:rPr>
       </w:pPr>
-      <w:hyperlink w:anchor="_Toc240369595" w:history="1">
+      <w:hyperlink w:anchor="_Toc240391970" w:history="1">
         <w:r>
           <w:rPr>
             <w:rStyle w:val="Hipervnculo"/>
             <w:noProof/>
           </w:rPr>
-          <w:t>6.1 Ordenamiento, limpieza y validación</w:t>
+          <w:t>6. Puntos: registrar, editar y validar</w:t>
         </w:r>
         <w:r>
           <w:rPr>
@@ -1520,7 +1535,7 @@
             <w:noProof/>
             <w:webHidden/>
           </w:rPr>
-          <w:instrText xml:space="preserve"> PAGEREF _Toc240369595 \h </w:instrText>
+          <w:instrText xml:space="preserve"> PAGEREF _Toc240391970 \h </w:instrText>
         </w:r>
         <w:r>
           <w:rPr>
@@ -1568,13 +1583,13 @@
           <w14:ligatures w14:val="standardContextual"/>
         </w:rPr>
       </w:pPr>
-      <w:hyperlink w:anchor="_Toc240369596" w:history="1">
+      <w:hyperlink w:anchor="_Toc240391971" w:history="1">
         <w:r>
           <w:rPr>
             <w:rStyle w:val="Hipervnculo"/>
             <w:noProof/>
           </w:rPr>
-          <w:t>7. Plano: herramientas cartesianas</w:t>
+          <w:t>6.1 Ordenamiento, limpieza y validación</w:t>
         </w:r>
         <w:r>
           <w:rPr>
@@ -1595,7 +1610,7 @@
             <w:noProof/>
             <w:webHidden/>
           </w:rPr>
-          <w:instrText xml:space="preserve"> PAGEREF _Toc240369596 \h </w:instrText>
+          <w:instrText xml:space="preserve"> PAGEREF _Toc240391971 \h </w:instrText>
         </w:r>
         <w:r>
           <w:rPr>
@@ -1643,13 +1658,13 @@
           <w14:ligatures w14:val="standardContextual"/>
         </w:rPr>
       </w:pPr>
-      <w:hyperlink w:anchor="_Toc240369597" w:history="1">
+      <w:hyperlink w:anchor="_Toc240391972" w:history="1">
         <w:r>
           <w:rPr>
             <w:rStyle w:val="Hipervnculo"/>
             <w:noProof/>
           </w:rPr>
-          <w:t>8. Cálculos: revisión de resultados</w:t>
+          <w:t>7. Plano: herramientas cartesianas</w:t>
         </w:r>
         <w:r>
           <w:rPr>
@@ -1670,7 +1685,7 @@
             <w:noProof/>
             <w:webHidden/>
           </w:rPr>
-          <w:instrText xml:space="preserve"> PAGEREF _Toc240369597 \h </w:instrText>
+          <w:instrText xml:space="preserve"> PAGEREF _Toc240391972 \h </w:instrText>
         </w:r>
         <w:r>
           <w:rPr>
@@ -1718,13 +1733,13 @@
           <w14:ligatures w14:val="standardContextual"/>
         </w:rPr>
       </w:pPr>
-      <w:hyperlink w:anchor="_Toc240369598" w:history="1">
+      <w:hyperlink w:anchor="_Toc240391973" w:history="1">
         <w:r>
           <w:rPr>
             <w:rStyle w:val="Hipervnculo"/>
             <w:noProof/>
           </w:rPr>
-          <w:t>9. Importar y exportar</w:t>
+          <w:t>8. Cálculos: revisión de resultados</w:t>
         </w:r>
         <w:r>
           <w:rPr>
@@ -1745,7 +1760,7 @@
             <w:noProof/>
             <w:webHidden/>
           </w:rPr>
-          <w:instrText xml:space="preserve"> PAGEREF _Toc240369598 \h </w:instrText>
+          <w:instrText xml:space="preserve"> PAGEREF _Toc240391973 \h </w:instrText>
         </w:r>
         <w:r>
           <w:rPr>
@@ -1793,7 +1808,82 @@
           <w14:ligatures w14:val="standardContextual"/>
         </w:rPr>
       </w:pPr>
-      <w:hyperlink w:anchor="_Toc240369599" w:history="1">
+      <w:hyperlink w:anchor="_Toc240391974" w:history="1">
+        <w:r>
+          <w:rPr>
+            <w:rStyle w:val="Hipervnculo"/>
+            <w:noProof/>
+          </w:rPr>
+          <w:t>9. Importar y exportar</w:t>
+        </w:r>
+        <w:r>
+          <w:rPr>
+            <w:noProof/>
+            <w:webHidden/>
+          </w:rPr>
+          <w:tab/>
+        </w:r>
+        <w:r>
+          <w:rPr>
+            <w:noProof/>
+            <w:webHidden/>
+          </w:rPr>
+          <w:fldChar w:fldCharType="begin"/>
+        </w:r>
+        <w:r>
+          <w:rPr>
+            <w:noProof/>
+            <w:webHidden/>
+          </w:rPr>
+          <w:instrText xml:space="preserve"> PAGEREF _Toc240391974 \h </w:instrText>
+        </w:r>
+        <w:r>
+          <w:rPr>
+            <w:noProof/>
+            <w:webHidden/>
+          </w:rPr>
+        </w:r>
+        <w:r>
+          <w:rPr>
+            <w:noProof/>
+            <w:webHidden/>
+          </w:rPr>
+          <w:fldChar w:fldCharType="separate"/>
+        </w:r>
+        <w:r>
+          <w:rPr>
+            <w:noProof/>
+            <w:webHidden/>
+          </w:rPr>
+          <w:t>13</w:t>
+        </w:r>
+        <w:r>
+          <w:rPr>
+            <w:noProof/>
+            <w:webHidden/>
+          </w:rPr>
+          <w:fldChar w:fldCharType="end"/>
+        </w:r>
+      </w:hyperlink>
+    </w:p>
+    <w:p>
+      <w:pPr>
+        <w:pStyle w:val="TDC1"/>
+        <w:tabs>
+          <w:tab w:val="right" w:leader="dot" w:pos="10190"/>
+        </w:tabs>
+        <w:rPr>
+          <w:rFonts w:asciiTheme="minorHAnsi" w:hAnsiTheme="minorHAnsi"/>
+          <w:noProof/>
+          <w:color w:val="auto"/>
+          <w:kern w:val="2"/>
+          <w:sz w:val="24"/>
+          <w:szCs w:val="24"/>
+          <w:lang w:val="es-CO" w:eastAsia="es-CO"/>
+          <w14:ligatures w14:val="standardContextual"/>
+        </w:rPr>
+      </w:pPr>
+      <w:hyperlink w:anchor="_Toc240391975" w:history="1">
         <w:r>
           <w:rPr>
             <w:rStyle w:val="Hipervnculo"/>
@@ -1820,82 +1910,7 @@
             <w:noProof/>
             <w:webHidden/>
           </w:rPr>
-          <w:instrText xml:space="preserve"> PAGEREF _Toc240369599 \h </w:instrText>
-        </w:r>
-        <w:r>
-          <w:rPr>
-            <w:noProof/>
-            <w:webHidden/>
-          </w:rPr>
-        </w:r>
-        <w:r>
-          <w:rPr>
-            <w:noProof/>
-            <w:webHidden/>
-          </w:rPr>
-          <w:fldChar w:fldCharType="separate"/>
-        </w:r>
-        <w:r>
-          <w:rPr>
-            <w:noProof/>
-            <w:webHidden/>
-          </w:rPr>
-          <w:t>14</w:t>
-        </w:r>
-        <w:r>
-          <w:rPr>
-            <w:noProof/>
-            <w:webHidden/>
-          </w:rPr>
-          <w:fldChar w:fldCharType="end"/>
-        </w:r>
-      </w:hyperlink>
-    </w:p>
-    <w:p>
-      <w:pPr>
-        <w:pStyle w:val="TDC1"/>
-        <w:tabs>
-          <w:tab w:val="right" w:leader="dot" w:pos="10190"/>
-        </w:tabs>
-        <w:rPr>
-          <w:rFonts w:asciiTheme="minorHAnsi" w:hAnsiTheme="minorHAnsi"/>
-          <w:noProof/>
-          <w:color w:val="auto"/>
-          <w:kern w:val="2"/>
-          <w:sz w:val="24"/>
-          <w:szCs w:val="24"/>
-          <w:lang w:val="es-CO" w:eastAsia="es-CO"/>
-          <w14:ligatures w14:val="standardContextual"/>
-        </w:rPr>
-      </w:pPr>
-      <w:hyperlink w:anchor="_Toc240369600" w:history="1">
-        <w:r>
-          <w:rPr>
-            <w:rStyle w:val="Hipervnculo"/>
-            <w:noProof/>
-          </w:rPr>
-          <w:t>11. Créditos</w:t>
-        </w:r>
-        <w:r>
-          <w:rPr>
-            <w:noProof/>
-            <w:webHidden/>
-          </w:rPr>
-          <w:tab/>
-        </w:r>
-        <w:r>
-          <w:rPr>
-            <w:noProof/>
-            <w:webHidden/>
-          </w:rPr>
-          <w:fldChar w:fldCharType="begin"/>
-        </w:r>
-        <w:r>
-          <w:rPr>
-            <w:noProof/>
-            <w:webHidden/>
-          </w:rPr>
-          <w:instrText xml:space="preserve"> PAGEREF _Toc240369600 \h </w:instrText>
+          <w:instrText xml:space="preserve"> PAGEREF _Toc240391975 \h </w:instrText>
         </w:r>
         <w:r>
           <w:rPr>
@@ -1943,13 +1958,13 @@
           <w14:ligatures w14:val="standardContextual"/>
         </w:rPr>
       </w:pPr>
-      <w:hyperlink w:anchor="_Toc240369601" w:history="1">
+      <w:hyperlink w:anchor="_Toc240391976" w:history="1">
         <w:r>
           <w:rPr>
             <w:rStyle w:val="Hipervnculo"/>
             <w:noProof/>
           </w:rPr>
-          <w:t>12. Guía paso a paso: levantamiento por radiación simple</w:t>
+          <w:t>11. Créditos</w:t>
         </w:r>
         <w:r>
           <w:rPr>
@@ -1970,7 +1985,7 @@
             <w:noProof/>
             <w:webHidden/>
           </w:rPr>
-          <w:instrText xml:space="preserve"> PAGEREF _Toc240369601 \h </w:instrText>
+          <w:instrText xml:space="preserve"> PAGEREF _Toc240391976 \h </w:instrText>
         </w:r>
         <w:r>
           <w:rPr>
@@ -2018,13 +2033,13 @@
           <w14:ligatures w14:val="standardContextual"/>
         </w:rPr>
       </w:pPr>
-      <w:hyperlink w:anchor="_Toc240369602" w:history="1">
+      <w:hyperlink w:anchor="_Toc240391977" w:history="1">
         <w:r>
           <w:rPr>
             <w:rStyle w:val="Hipervnculo"/>
             <w:noProof/>
           </w:rPr>
-          <w:t>12.1 Captura de los cuatro vértices</w:t>
+          <w:t>12. Guía paso a paso: levantamiento por radiación simple</w:t>
         </w:r>
         <w:r>
           <w:rPr>
@@ -2045,7 +2060,7 @@
             <w:noProof/>
             <w:webHidden/>
           </w:rPr>
-          <w:instrText xml:space="preserve"> PAGEREF _Toc240369602 \h </w:instrText>
+          <w:instrText xml:space="preserve"> PAGEREF _Toc240391977 \h </w:instrText>
         </w:r>
         <w:r>
           <w:rPr>
@@ -2093,13 +2108,13 @@
           <w14:ligatures w14:val="standardContextual"/>
         </w:rPr>
       </w:pPr>
-      <w:hyperlink w:anchor="_Toc240369603" w:history="1">
+      <w:hyperlink w:anchor="_Toc240391978" w:history="1">
         <w:r>
           <w:rPr>
             <w:rStyle w:val="Hipervnculo"/>
             <w:noProof/>
           </w:rPr>
-          <w:t>12.2 Comprobación del plano y de los cálculos</w:t>
+          <w:t>12.1 Captura de los cuatro vértices</w:t>
         </w:r>
         <w:r>
           <w:rPr>
@@ -2120,7 +2135,7 @@
             <w:noProof/>
             <w:webHidden/>
           </w:rPr>
-          <w:instrText xml:space="preserve"> PAGEREF _Toc240369603 \h </w:instrText>
+          <w:instrText xml:space="preserve"> PAGEREF _Toc240391978 \h </w:instrText>
         </w:r>
         <w:r>
           <w:rPr>
@@ -2168,13 +2183,13 @@
           <w14:ligatures w14:val="standardContextual"/>
         </w:rPr>
       </w:pPr>
-      <w:hyperlink w:anchor="_Toc240369604" w:history="1">
+      <w:hyperlink w:anchor="_Toc240391979" w:history="1">
         <w:r>
           <w:rPr>
             <w:rStyle w:val="Hipervnculo"/>
             <w:noProof/>
           </w:rPr>
-          <w:t>12.3 Guardado, respaldo y entrega</w:t>
+          <w:t>12.2 Comprobación del plano y de los cálculos</w:t>
         </w:r>
         <w:r>
           <w:rPr>
@@ -2195,7 +2210,7 @@
             <w:noProof/>
             <w:webHidden/>
           </w:rPr>
-          <w:instrText xml:space="preserve"> PAGEREF _Toc240369604 \h </w:instrText>
+          <w:instrText xml:space="preserve"> PAGEREF _Toc240391979 \h </w:instrText>
         </w:r>
         <w:r>
           <w:rPr>
@@ -2243,7 +2258,82 @@
           <w14:ligatures w14:val="standardContextual"/>
         </w:rPr>
       </w:pPr>
-      <w:hyperlink w:anchor="_Toc240369605" w:history="1">
+      <w:hyperlink w:anchor="_Toc240391980" w:history="1">
+        <w:r>
+          <w:rPr>
+            <w:rStyle w:val="Hipervnculo"/>
+            <w:noProof/>
+          </w:rPr>
+          <w:t>12.3 Guardado, respaldo y entrega</w:t>
+        </w:r>
+        <w:r>
+          <w:rPr>
+            <w:noProof/>
+            <w:webHidden/>
+          </w:rPr>
+          <w:tab/>
+        </w:r>
+        <w:r>
+          <w:rPr>
+            <w:noProof/>
+            <w:webHidden/>
+          </w:rPr>
+          <w:fldChar w:fldCharType="begin"/>
+        </w:r>
+        <w:r>
+          <w:rPr>
+            <w:noProof/>
+            <w:webHidden/>
+          </w:rPr>
+          <w:instrText xml:space="preserve"> PAGEREF _Toc240391980 \h </w:instrText>
+        </w:r>
+        <w:r>
+          <w:rPr>
+            <w:noProof/>
+            <w:webHidden/>
+          </w:rPr>
+        </w:r>
+        <w:r>
+          <w:rPr>
+            <w:noProof/>
+            <w:webHidden/>
+          </w:rPr>
+          <w:fldChar w:fldCharType="separate"/>
+        </w:r>
+        <w:r>
+          <w:rPr>
+            <w:noProof/>
+            <w:webHidden/>
+          </w:rPr>
+          <w:t>20</w:t>
+        </w:r>
+        <w:r>
+          <w:rPr>
+            <w:noProof/>
+            <w:webHidden/>
+          </w:rPr>
+          <w:fldChar w:fldCharType="end"/>
+        </w:r>
+      </w:hyperlink>
+    </w:p>
+    <w:p>
+      <w:pPr>
+        <w:pStyle w:val="TDC1"/>
+        <w:tabs>
+          <w:tab w:val="right" w:leader="dot" w:pos="10190"/>
+        </w:tabs>
+        <w:rPr>
+          <w:rFonts w:asciiTheme="minorHAnsi" w:hAnsiTheme="minorHAnsi"/>
+          <w:noProof/>
+          <w:color w:val="auto"/>
+          <w:kern w:val="2"/>
+          <w:sz w:val="24"/>
+          <w:szCs w:val="24"/>
+          <w:lang w:val="es-CO" w:eastAsia="es-CO"/>
+          <w14:ligatures w14:val="standardContextual"/>
+        </w:rPr>
+      </w:pPr>
+      <w:hyperlink w:anchor="_Toc240391981" w:history="1">
         <w:r>
           <w:rPr>
             <w:rStyle w:val="Hipervnculo"/>
@@ -2270,82 +2360,7 @@
             <w:noProof/>
             <w:webHidden/>
           </w:rPr>
-          <w:instrText xml:space="preserve"> PAGEREF _Toc240369605 \h </w:instrText>
-        </w:r>
-        <w:r>
-          <w:rPr>
-            <w:noProof/>
-            <w:webHidden/>
-          </w:rPr>
-        </w:r>
-        <w:r>
-          <w:rPr>
-            <w:noProof/>
-            <w:webHidden/>
-          </w:rPr>
-          <w:fldChar w:fldCharType="separate"/>
-        </w:r>
-        <w:r>
-          <w:rPr>
-            <w:noProof/>
-            <w:webHidden/>
-          </w:rPr>
-          <w:t>21</w:t>
-        </w:r>
-        <w:r>
-          <w:rPr>
-            <w:noProof/>
-            <w:webHidden/>
-          </w:rPr>
-          <w:fldChar w:fldCharType="end"/>
-        </w:r>
-      </w:hyperlink>
-    </w:p>
-    <w:p>
-      <w:pPr>
-        <w:pStyle w:val="TDC1"/>
-        <w:tabs>
-          <w:tab w:val="right" w:leader="dot" w:pos="10190"/>
-        </w:tabs>
-        <w:rPr>
-          <w:rFonts w:asciiTheme="minorHAnsi" w:hAnsiTheme="minorHAnsi"/>
-          <w:noProof/>
-          <w:color w:val="auto"/>
-          <w:kern w:val="2"/>
-          <w:sz w:val="24"/>
-          <w:szCs w:val="24"/>
-          <w:lang w:val="es-CO" w:eastAsia="es-CO"/>
-          <w14:ligatures w14:val="standardContextual"/>
-        </w:rPr>
-      </w:pPr>
-      <w:hyperlink w:anchor="_Toc240369606" w:history="1">
-        <w:r>
-          <w:rPr>
-            <w:rStyle w:val="Hipervnculo"/>
-            <w:noProof/>
-          </w:rPr>
-          <w:t>14. Conservación de datos y glosario</w:t>
-        </w:r>
-        <w:r>
-          <w:rPr>
-            <w:noProof/>
-            <w:webHidden/>
-          </w:rPr>
-          <w:tab/>
-        </w:r>
-        <w:r>
-          <w:rPr>
-            <w:noProof/>
-            <w:webHidden/>
-          </w:rPr>
-          <w:fldChar w:fldCharType="begin"/>
-        </w:r>
-        <w:r>
-          <w:rPr>
-            <w:noProof/>
-            <w:webHidden/>
-          </w:rPr>
-          <w:instrText xml:space="preserve"> PAGEREF _Toc240369606 \h </w:instrText>
+          <w:instrText xml:space="preserve"> PAGEREF _Toc240391981 \h </w:instrText>
         </w:r>
         <w:r>
           <w:rPr>
@@ -2378,6 +2393,81 @@
     </w:p>
     <w:p>
       <w:pPr>
+        <w:pStyle w:val="TDC1"/>
+        <w:tabs>
+          <w:tab w:val="right" w:leader="dot" w:pos="10190"/>
+        </w:tabs>
+        <w:rPr>
+          <w:rFonts w:asciiTheme="minorHAnsi" w:hAnsiTheme="minorHAnsi"/>
+          <w:noProof/>
+          <w:color w:val="auto"/>
+          <w:kern w:val="2"/>
+          <w:sz w:val="24"/>
+          <w:szCs w:val="24"/>
+          <w:lang w:val="es-CO" w:eastAsia="es-CO"/>
+          <w14:ligatures w14:val="standardContextual"/>
+        </w:rPr>
+      </w:pPr>
+      <w:hyperlink w:anchor="_Toc240391982" w:history="1">
+        <w:r>
+          <w:rPr>
+            <w:rStyle w:val="Hipervnculo"/>
+            <w:noProof/>
+          </w:rPr>
+          <w:t>14. Conservación de datos y glosario</w:t>
+        </w:r>
+        <w:r>
+          <w:rPr>
+            <w:noProof/>
+            <w:webHidden/>
+          </w:rPr>
+          <w:tab/>
+        </w:r>
+        <w:r>
+          <w:rPr>
+            <w:noProof/>
+            <w:webHidden/>
+          </w:rPr>
+          <w:fldChar w:fldCharType="begin"/>
+        </w:r>
+        <w:r>
+          <w:rPr>
+            <w:noProof/>
+            <w:webHidden/>
+          </w:rPr>
+          <w:instrText xml:space="preserve"> PAGEREF _Toc240391982 \h </w:instrText>
+        </w:r>
+        <w:r>
+          <w:rPr>
+            <w:noProof/>
+            <w:webHidden/>
+          </w:rPr>
+        </w:r>
+        <w:r>
+          <w:rPr>
+            <w:noProof/>
+            <w:webHidden/>
+          </w:rPr>
+          <w:fldChar w:fldCharType="separate"/>
+        </w:r>
+        <w:r>
+          <w:rPr>
+            <w:noProof/>
+            <w:webHidden/>
+          </w:rPr>
+          <w:t>23</w:t>
+        </w:r>
+        <w:r>
+          <w:rPr>
+            <w:noProof/>
+            <w:webHidden/>
+          </w:rPr>
+          <w:fldChar w:fldCharType="end"/>
+        </w:r>
+      </w:hyperlink>
+    </w:p>
+    <w:p>
+      <w:pPr>
         <w:spacing w:after="160"/>
         <w:rPr>
           <w:rFonts w:hint="eastAsia"/>
@@ -2401,7 +2491,7 @@
       <w:pPr>
         <w:pStyle w:val="Ttulo1"/>
       </w:pPr>
-      <w:bookmarkStart w:id="0" w:name="_Toc240369589"/>
+      <w:bookmarkStart w:id="0" w:name="_Toc240391965"/>
       <w:r>
         <w:rPr>
           <w:rFonts w:ascii="Segoe UI" w:hAnsi="Segoe UI"/>
@@ -2895,7 +2985,7 @@
       <w:pPr>
         <w:pStyle w:val="Ttulo1"/>
       </w:pPr>
-      <w:bookmarkStart w:id="1" w:name="_Toc240369590"/>
+      <w:bookmarkStart w:id="1" w:name="_Toc240391966"/>
       <w:r>
         <w:rPr>
           <w:rFonts w:ascii="Segoe UI" w:hAnsi="Segoe UI"/>
@@ -3489,7 +3579,7 @@
       <w:pPr>
         <w:pStyle w:val="Ttulo1"/>
       </w:pPr>
-      <w:bookmarkStart w:id="2" w:name="_Toc240369591"/>
+      <w:bookmarkStart w:id="2" w:name="_Toc240391967"/>
       <w:r>
         <w:rPr>
           <w:rFonts w:ascii="Segoe UI" w:hAnsi="Segoe UI"/>
@@ -3530,7 +3620,7 @@
           <w:noProof/>
         </w:rPr>
         <w:drawing>
-          <wp:inline distT="0" distB="0" distL="0" distR="0" wp14:anchorId="636443F1" wp14:editId="188F5DD4">
+          <wp:inline distT="0" distB="0" distL="0" distR="0" wp14:anchorId="35FBA434" wp14:editId="11D728D9">
             <wp:extent cx="6476400" cy="3645215"/>
             <wp:effectExtent l="0" t="0" r="0" b="0"/>
             <wp:docPr id="2" name="Picture 2" descr="Vista principal del plano cartesiano de TOPORAY." title="Vista principal del plano cartesiano de TOPORAY."/>
@@ -4104,7 +4194,7 @@
               <w:rPr>
                 <w:sz w:val="15"/>
               </w:rPr>
-              <w:t>Al iniciar TOPORAY aparece un aviso para revisar este manual antes de capturar o importar datos. Use Abrir manual de usuario para consultar la guía y Entendido para continuar. El aviso se muestra una vez durante cada sesión del navegador.</w:t>
+              <w:t>Al iniciar TOPORAY aparece un aviso para revisar este manual antes de capturar o importar datos. Use Abrir manual de usuario para consultar la guía y Entendido para continuar. Este aviso de entrada se muestra una vez durante cada sesión. Además, cada vez que pulse Coordenadas TXT, el aviso volverá a aparecer antes de la descarga y deberá confirmar con Descargar TXT.</w:t>
             </w:r>
           </w:p>
         </w:tc>
@@ -4132,7 +4222,7 @@
       <w:pPr>
         <w:pStyle w:val="Ttulo1"/>
       </w:pPr>
-      <w:bookmarkStart w:id="3" w:name="_Toc240369592"/>
+      <w:bookmarkStart w:id="3" w:name="_Toc240391968"/>
       <w:r>
         <w:rPr>
           <w:rFonts w:ascii="Segoe UI" w:hAnsi="Segoe UI"/>
@@ -4163,7 +4253,7 @@
           <w:noProof/>
         </w:rPr>
         <w:drawing>
-          <wp:inline distT="0" distB="0" distL="0" distR="0" wp14:anchorId="4F0F495C" wp14:editId="187E22DE">
+          <wp:inline distT="0" distB="0" distL="0" distR="0" wp14:anchorId="0646CB07" wp14:editId="64E775E0">
             <wp:extent cx="6476400" cy="3642975"/>
             <wp:effectExtent l="0" t="0" r="0" b="0"/>
             <wp:docPr id="3" name="Picture 3" descr="Vista para crear, guardar y abrir proyectos." title="Vista para crear, guardar y abrir proyectos."/>
@@ -4417,7 +4507,7 @@
       <w:pPr>
         <w:pStyle w:val="Ttulo1"/>
       </w:pPr>
-      <w:bookmarkStart w:id="4" w:name="_Toc240369593"/>
+      <w:bookmarkStart w:id="4" w:name="_Toc240391969"/>
       <w:r>
         <w:rPr>
           <w:rFonts w:ascii="Segoe UI" w:hAnsi="Segoe UI"/>
@@ -4448,7 +4538,7 @@
           <w:noProof/>
         </w:rPr>
         <w:drawing>
-          <wp:inline distT="0" distB="0" distL="0" distR="0" wp14:anchorId="3A0C6D53" wp14:editId="09CAD85B">
+          <wp:inline distT="0" distB="0" distL="0" distR="0" wp14:anchorId="1EA20445" wp14:editId="488A8223">
             <wp:extent cx="6476400" cy="3642975"/>
             <wp:effectExtent l="0" t="0" r="0" b="0"/>
             <wp:docPr id="4" name="Picture 4" descr="Vista para administrar las zonas del levantamiento." title="Vista para administrar las zonas del levantamiento."/>
@@ -4936,7 +5026,7 @@
       <w:pPr>
         <w:pStyle w:val="Ttulo1"/>
       </w:pPr>
-      <w:bookmarkStart w:id="5" w:name="_Toc240369594"/>
+      <w:bookmarkStart w:id="5" w:name="_Toc240391970"/>
       <w:r>
         <w:rPr>
           <w:rFonts w:ascii="Segoe UI" w:hAnsi="Segoe UI"/>
@@ -5013,7 +5103,7 @@
                 <w:noProof/>
               </w:rPr>
               <w:drawing>
-                <wp:inline distT="0" distB="0" distL="0" distR="0" wp14:anchorId="45DACE4F" wp14:editId="76298FD4">
+                <wp:inline distT="0" distB="0" distL="0" distR="0" wp14:anchorId="04AF65F7" wp14:editId="57E761C3">
                   <wp:extent cx="3064972" cy="1725107"/>
                   <wp:effectExtent l="0" t="0" r="0" b="0"/>
                   <wp:docPr id="5" name="Picture 5" descr="Formulario para agregar una observación topográfica." title="Formulario para agregar una observación topográfica."/>
@@ -5080,7 +5170,7 @@
                 <w:noProof/>
               </w:rPr>
               <w:drawing>
-                <wp:inline distT="0" distB="0" distL="0" distR="0" wp14:anchorId="337F9DC5" wp14:editId="41D45BD1">
+                <wp:inline distT="0" distB="0" distL="0" distR="0" wp14:anchorId="629E560C" wp14:editId="6F57ECE3">
                   <wp:extent cx="3064972" cy="1725107"/>
                   <wp:effectExtent l="0" t="0" r="0" b="0"/>
                   <wp:docPr id="6" name="Picture 6" descr="Tabla editable de puntos del levantamiento." title="Tabla editable de puntos del levantamiento."/>
@@ -5377,7 +5467,7 @@
       <w:pPr>
         <w:pStyle w:val="Ttulo1"/>
       </w:pPr>
-      <w:bookmarkStart w:id="6" w:name="_Toc240369595"/>
+      <w:bookmarkStart w:id="6" w:name="_Toc240391971"/>
       <w:r>
         <w:rPr>
           <w:rFonts w:ascii="Segoe UI" w:hAnsi="Segoe UI"/>
@@ -5963,7 +6053,7 @@
       <w:pPr>
         <w:pStyle w:val="Ttulo1"/>
       </w:pPr>
-      <w:bookmarkStart w:id="7" w:name="_Toc240369596"/>
+      <w:bookmarkStart w:id="7" w:name="_Toc240391972"/>
       <w:r>
         <w:rPr>
           <w:rFonts w:ascii="Segoe UI" w:hAnsi="Segoe UI"/>
@@ -5994,7 +6084,7 @@
           <w:noProof/>
         </w:rPr>
         <w:drawing>
-          <wp:inline distT="0" distB="0" distL="0" distR="0" wp14:anchorId="0AD3452F" wp14:editId="6611D0E6">
+          <wp:inline distT="0" distB="0" distL="0" distR="0" wp14:anchorId="1B27BB33" wp14:editId="5E455B62">
             <wp:extent cx="6476400" cy="3645215"/>
             <wp:effectExtent l="0" t="0" r="0" b="0"/>
             <wp:docPr id="7" name="Picture 7" descr="Vista principal del plano cartesiano de TOPORAY." title="Vista principal del plano cartesiano de TOPORAY."/>
@@ -6581,7 +6671,7 @@
       <w:pPr>
         <w:pStyle w:val="Ttulo1"/>
       </w:pPr>
-      <w:bookmarkStart w:id="8" w:name="_Toc240369597"/>
+      <w:bookmarkStart w:id="8" w:name="_Toc240391973"/>
       <w:r>
         <w:rPr>
           <w:rFonts w:ascii="Segoe UI" w:hAnsi="Segoe UI"/>
@@ -6612,7 +6702,7 @@
           <w:noProof/>
         </w:rPr>
         <w:drawing>
-          <wp:inline distT="0" distB="0" distL="0" distR="0" wp14:anchorId="5487E391" wp14:editId="7C320D9C">
+          <wp:inline distT="0" distB="0" distL="0" distR="0" wp14:anchorId="25CF9FDC" wp14:editId="29348BEC">
             <wp:extent cx="6476400" cy="3643944"/>
             <wp:effectExtent l="0" t="0" r="0" b="0"/>
             <wp:docPr id="8" name="Picture 8" descr="Vista de cálculos, rumbos, proyecciones y coordenadas." title="Vista de cálculos, rumbos, proyecciones y coordenadas."/>
@@ -6761,7 +6851,7 @@
       <w:pPr>
         <w:pStyle w:val="Ttulo1"/>
       </w:pPr>
-      <w:bookmarkStart w:id="9" w:name="_Toc240369598"/>
+      <w:bookmarkStart w:id="9" w:name="_Toc240391974"/>
       <w:r>
         <w:rPr>
           <w:rFonts w:ascii="Segoe UI" w:hAnsi="Segoe UI"/>
@@ -6792,7 +6882,7 @@
           <w:noProof/>
         </w:rPr>
         <w:drawing>
-          <wp:inline distT="0" distB="0" distL="0" distR="0" wp14:anchorId="27411501" wp14:editId="06CFA09B">
+          <wp:inline distT="0" distB="0" distL="0" distR="0" wp14:anchorId="5FE89DC5" wp14:editId="79F981E1">
             <wp:extent cx="6476400" cy="3642975"/>
             <wp:effectExtent l="0" t="0" r="0" b="0"/>
             <wp:docPr id="9" name="Picture 9" descr="Vista de importación y exportación de archivos." title="Vista de importación y exportación de archivos."/>
@@ -7272,7 +7362,7 @@
               <w:rPr>
                 <w:sz w:val="15"/>
               </w:rPr>
-              <w:t>La numeración del TXT es continua para todas las zonas: 1, 2, 3… No incluye encabezado, espacios de alineación ni marca BOM. Cada fila usa Punto,Este,Norte,0,Descripción, con comas como separadores, punto decimal y codificación UTF-8. La cuarta columna representa la elevación Z y siempre vale 0.</w:t>
+              <w:t>Al pulsar Coordenadas TXT se abre primero el aviso de revisión del manual. El archivo solo se genera después de pulsar Descargar TXT. Su numeración es continua para todas las zonas: 1, 2, 3… No incluye encabezado, espacios de alineación ni marca BOM. Cada fila usa Punto,Este,Norte,0,Descripción, con comas como separadores, punto decimal y codificación UTF-8. La cuarta columna representa la elevación Z y siempre vale 0.</w:t>
             </w:r>
           </w:p>
         </w:tc>
@@ -7469,7 +7559,7 @@
       <w:pPr>
         <w:pStyle w:val="Ttulo1"/>
       </w:pPr>
-      <w:bookmarkStart w:id="10" w:name="_Toc240369599"/>
+      <w:bookmarkStart w:id="10" w:name="_Toc240391975"/>
       <w:r>
         <w:rPr>
           <w:rFonts w:ascii="Segoe UI" w:hAnsi="Segoe UI"/>
@@ -7500,7 +7590,7 @@
           <w:noProof/>
         </w:rPr>
         <w:drawing>
-          <wp:inline distT="0" distB="0" distL="0" distR="0" wp14:anchorId="66511A98" wp14:editId="50763393">
+          <wp:inline distT="0" distB="0" distL="0" distR="0" wp14:anchorId="73F8837B" wp14:editId="1FD8F182">
             <wp:extent cx="6476400" cy="3645215"/>
             <wp:effectExtent l="0" t="0" r="0" b="0"/>
             <wp:docPr id="10" name="Picture 10" descr="Vista de configuración de coordenadas, unidades y escala." title="Vista de configuración de coordenadas, unidades y escala."/>
@@ -7736,7 +7826,7 @@
       <w:pPr>
         <w:pStyle w:val="Ttulo1"/>
       </w:pPr>
-      <w:bookmarkStart w:id="11" w:name="_Toc240369600"/>
+      <w:bookmarkStart w:id="11" w:name="_Toc240391976"/>
       <w:r>
         <w:rPr>
           <w:rFonts w:ascii="Segoe UI" w:hAnsi="Segoe UI"/>
@@ -7777,7 +7867,7 @@
           <w:noProof/>
         </w:rPr>
         <w:drawing>
-          <wp:inline distT="0" distB="0" distL="0" distR="0" wp14:anchorId="61A57FFE" wp14:editId="252C1B33">
+          <wp:inline distT="0" distB="0" distL="0" distR="0" wp14:anchorId="60B5CA63" wp14:editId="392220B7">
             <wp:extent cx="5531555" cy="3111500"/>
             <wp:effectExtent l="0" t="0" r="0" b="0"/>
             <wp:docPr id="11" name="Picture 11" descr="Vista de créditos y autores de TOPORAY." title="Vista de créditos y autores de TOPORAY."/>
@@ -8237,7 +8327,7 @@
       <w:pPr>
         <w:pStyle w:val="Ttulo1"/>
       </w:pPr>
-      <w:bookmarkStart w:id="12" w:name="_Toc240369601"/>
+      <w:bookmarkStart w:id="12" w:name="_Toc240391977"/>
       <w:r>
         <w:rPr>
           <w:rFonts w:ascii="Segoe UI" w:hAnsi="Segoe UI"/>
@@ -9224,7 +9314,7 @@
                 <w:noProof/>
               </w:rPr>
               <w:drawing>
-                <wp:inline distT="0" distB="0" distL="0" distR="0" wp14:anchorId="281C4AE5" wp14:editId="60720516">
+                <wp:inline distT="0" distB="0" distL="0" distR="0" wp14:anchorId="6D4DE3C5" wp14:editId="6027EDDB">
                   <wp:extent cx="3064972" cy="1724047"/>
                   <wp:effectExtent l="0" t="0" r="0" b="0"/>
                   <wp:docPr id="12" name="Picture 12" descr="Vista para crear, guardar y abrir proyectos." title="Vista para crear, guardar y abrir proyectos."/>
@@ -9291,7 +9381,7 @@
                 <w:noProof/>
               </w:rPr>
               <w:drawing>
-                <wp:inline distT="0" distB="0" distL="0" distR="0" wp14:anchorId="113A0B4A" wp14:editId="7ACFD7BE">
+                <wp:inline distT="0" distB="0" distL="0" distR="0" wp14:anchorId="76DCDCF9" wp14:editId="12162450">
                   <wp:extent cx="3064972" cy="1724047"/>
                   <wp:effectExtent l="0" t="0" r="0" b="0"/>
                   <wp:docPr id="13" name="Picture 13" descr="Vista para administrar las zonas del levantamiento." title="Vista para administrar las zonas del levantamiento."/>
@@ -9410,7 +9500,7 @@
       <w:pPr>
         <w:pStyle w:val="Ttulo1"/>
       </w:pPr>
-      <w:bookmarkStart w:id="13" w:name="_Toc240369602"/>
+      <w:bookmarkStart w:id="13" w:name="_Toc240391978"/>
       <w:r>
         <w:rPr>
           <w:rFonts w:ascii="Segoe UI" w:hAnsi="Segoe UI"/>
@@ -9480,7 +9570,7 @@
                 <w:noProof/>
               </w:rPr>
               <w:drawing>
-                <wp:inline distT="0" distB="0" distL="0" distR="0" wp14:anchorId="12948744" wp14:editId="6715FD43">
+                <wp:inline distT="0" distB="0" distL="0" distR="0" wp14:anchorId="767BBB3E" wp14:editId="03CB43D8">
                   <wp:extent cx="3064972" cy="1725107"/>
                   <wp:effectExtent l="0" t="0" r="0" b="0"/>
                   <wp:docPr id="14" name="Picture 14" descr="Formulario para agregar una observación topográfica." title="Formulario para agregar una observación topográfica."/>
@@ -9547,7 +9637,7 @@
                 <w:noProof/>
               </w:rPr>
               <w:drawing>
-                <wp:inline distT="0" distB="0" distL="0" distR="0" wp14:anchorId="51A1F112" wp14:editId="4CAA116F">
+                <wp:inline distT="0" distB="0" distL="0" distR="0" wp14:anchorId="27F674EF" wp14:editId="34F0C8E5">
                   <wp:extent cx="3064972" cy="1725107"/>
                   <wp:effectExtent l="0" t="0" r="0" b="0"/>
                   <wp:docPr id="15" name="Picture 15" descr="Tabla editable de puntos del levantamiento." title="Tabla editable de puntos del levantamiento."/>
@@ -9793,7 +9883,7 @@
       <w:pPr>
         <w:pStyle w:val="Ttulo1"/>
       </w:pPr>
-      <w:bookmarkStart w:id="14" w:name="_Toc240369603"/>
+      <w:bookmarkStart w:id="14" w:name="_Toc240391979"/>
       <w:r>
         <w:rPr>
           <w:rFonts w:ascii="Segoe UI" w:hAnsi="Segoe UI"/>
@@ -9853,7 +9943,7 @@
                 <w:noProof/>
               </w:rPr>
               <w:drawing>
-                <wp:inline distT="0" distB="0" distL="0" distR="0" wp14:anchorId="336BBD9F" wp14:editId="47563EA0">
+                <wp:inline distT="0" distB="0" distL="0" distR="0" wp14:anchorId="1457CB64" wp14:editId="072278C6">
                   <wp:extent cx="3064972" cy="1725107"/>
                   <wp:effectExtent l="0" t="0" r="0" b="0"/>
                   <wp:docPr id="16" name="Picture 16" descr="Vista principal del plano cartesiano de TOPORAY." title="Vista principal del plano cartesiano de TOPORAY."/>
@@ -9920,7 +10010,7 @@
                 <w:noProof/>
               </w:rPr>
               <w:drawing>
-                <wp:inline distT="0" distB="0" distL="0" distR="0" wp14:anchorId="52AD4D00" wp14:editId="5D6FE0C6">
+                <wp:inline distT="0" distB="0" distL="0" distR="0" wp14:anchorId="507FF54F" wp14:editId="57F2A613">
                   <wp:extent cx="3064972" cy="1724505"/>
                   <wp:effectExtent l="0" t="0" r="0" b="0"/>
                   <wp:docPr id="17" name="Picture 17" descr="Vista de cálculos, rumbos, proyecciones y coordenadas." title="Vista de cálculos, rumbos, proyecciones y coordenadas."/>
@@ -10911,7 +11001,7 @@
       <w:pPr>
         <w:pStyle w:val="Ttulo1"/>
       </w:pPr>
-      <w:bookmarkStart w:id="15" w:name="_Toc240369604"/>
+      <w:bookmarkStart w:id="15" w:name="_Toc240391980"/>
       <w:r>
         <w:rPr>
           <w:rFonts w:ascii="Segoe UI" w:hAnsi="Segoe UI"/>
@@ -10935,7 +11025,7 @@
           <w:noProof/>
         </w:rPr>
         <w:drawing>
-          <wp:inline distT="0" distB="0" distL="0" distR="0" wp14:anchorId="280EFBB9" wp14:editId="61DBC258">
+          <wp:inline distT="0" distB="0" distL="0" distR="0" wp14:anchorId="12DA0098" wp14:editId="50558AF4">
             <wp:extent cx="5983111" cy="3365500"/>
             <wp:effectExtent l="0" t="0" r="0" b="0"/>
             <wp:docPr id="18" name="Picture 18" descr="Vista de importación y exportación de archivos." title="Vista de importación y exportación de archivos."/>
@@ -11487,7 +11577,7 @@
       <w:pPr>
         <w:pStyle w:val="Ttulo1"/>
       </w:pPr>
-      <w:bookmarkStart w:id="16" w:name="_Toc240369605"/>
+      <w:bookmarkStart w:id="16" w:name="_Toc240391981"/>
       <w:r>
         <w:rPr>
           <w:rFonts w:ascii="Segoe UI" w:hAnsi="Segoe UI"/>
@@ -11554,7 +11644,7 @@
                 <w:noProof/>
               </w:rPr>
               <w:drawing>
-                <wp:inline distT="0" distB="0" distL="0" distR="0" wp14:anchorId="46BB9784" wp14:editId="25B06BDC">
+                <wp:inline distT="0" distB="0" distL="0" distR="0" wp14:anchorId="7CC09445" wp14:editId="03050EE9">
                   <wp:extent cx="2031013" cy="4247998"/>
                   <wp:effectExtent l="0" t="0" r="0" b="0"/>
                   <wp:docPr id="19" name="Picture 19" descr="Presentación móvil de TOPORAY." title="Presentación móvil de TOPORAY."/>
@@ -12196,7 +12286,7 @@
       <w:pPr>
         <w:pStyle w:val="Ttulo1"/>
       </w:pPr>
-      <w:bookmarkStart w:id="17" w:name="_Toc240369606"/>
+      <w:bookmarkStart w:id="17" w:name="_Toc240391982"/>
       <w:r>
         <w:rPr>
           <w:rFonts w:ascii="Segoe UI" w:hAnsi="Segoe UI"/>
@@ -12971,7 +13061,7 @@
         <w:color w:val="5D6B72"/>
         <w:sz w:val="15"/>
       </w:rPr>
-      <w:t>TOPORAY | Documento técnico | Revisión 1.3</w:t>
+      <w:t>TOPORAY | Documento técnico | Revisión 1.4</w:t>
     </w:r>
   </w:p>
 </w:ftr>
@@ -13037,7 +13127,7 @@
         <w:sz w:val="15"/>
       </w:rPr>
       <w:tab/>
-      <w:t>TOPORAY | Software 1.0 | Revisión 1.3</w:t>
+      <w:t>TOPORAY | Software 1.0 | Revisión 1.4</w:t>
     </w:r>
   </w:p>
 </w:hdr>
@@ -13211,9 +13301,9 @@
     </w:lvl>
   </w:abstractNum>
   <w:abstractNum w:abstractNumId="9" w15:restartNumberingAfterBreak="0">
-    <w:nsid w:val="020656F1"/>
+    <w:nsid w:val="039F0F92"/>
     <w:multiLevelType w:val="singleLevel"/>
-    <w:tmpl w:val="2C7AB252"/>
+    <w:tmpl w:val="1394713E"/>
     <w:lvl w:ilvl="0">
       <w:start w:val="1"/>
       <w:numFmt w:val="bullet"/>
@@ -13228,9 +13318,60 @@
     </w:lvl>
   </w:abstractNum>
   <w:abstractNum w:abstractNumId="10" w15:restartNumberingAfterBreak="0">
-    <w:nsid w:val="0A2E3774"/>
+    <w:nsid w:val="332C4A8E"/>
     <w:multiLevelType w:val="singleLevel"/>
-    <w:tmpl w:val="4C50196A"/>
+    <w:tmpl w:val="D74E82C2"/>
+    <w:lvl w:ilvl="0">
+      <w:start w:val="1"/>
+      <w:numFmt w:val="bullet"/>
+      <w:lvlText w:val="•"/>
+      <w:lvlJc w:val="left"/>
+      <w:pPr>
+        <w:tabs>
+          <w:tab w:val="num" w:pos="540"/>
+        </w:tabs>
+        <w:ind w:left="540" w:hanging="270"/>
+      </w:pPr>
+    </w:lvl>
+  </w:abstractNum>
+  <w:abstractNum w:abstractNumId="11" w15:restartNumberingAfterBreak="0">
+    <w:nsid w:val="3A25530F"/>
+    <w:multiLevelType w:val="singleLevel"/>
+    <w:tmpl w:val="79AC30CE"/>
+    <w:lvl w:ilvl="0">
+      <w:start w:val="1"/>
+      <w:numFmt w:val="bullet"/>
+      <w:lvlText w:val="•"/>
+      <w:lvlJc w:val="left"/>
+      <w:pPr>
+        <w:tabs>
+          <w:tab w:val="num" w:pos="540"/>
+        </w:tabs>
+        <w:ind w:left="540" w:hanging="270"/>
+      </w:pPr>
+    </w:lvl>
+  </w:abstractNum>
+  <w:abstractNum w:abstractNumId="12" w15:restartNumberingAfterBreak="0">
+    <w:nsid w:val="3AA75C4B"/>
+    <w:multiLevelType w:val="singleLevel"/>
+    <w:tmpl w:val="C4B29150"/>
+    <w:lvl w:ilvl="0">
+      <w:start w:val="1"/>
+      <w:numFmt w:val="bullet"/>
+      <w:lvlText w:val="•"/>
+      <w:lvlJc w:val="left"/>
+      <w:pPr>
+        <w:tabs>
+          <w:tab w:val="num" w:pos="540"/>
+        </w:tabs>
+        <w:ind w:left="540" w:hanging="270"/>
+      </w:pPr>
+    </w:lvl>
+  </w:abstractNum>
+  <w:abstractNum w:abstractNumId="13" w15:restartNumberingAfterBreak="0">
+    <w:nsid w:val="3D1103DC"/>
+    <w:multiLevelType w:val="singleLevel"/>
+    <w:tmpl w:val="685043EE"/>
     <w:lvl w:ilvl="0">
       <w:start w:val="1"/>
       <w:numFmt w:val="decimal"/>
@@ -13244,10 +13385,27 @@
       </w:pPr>
     </w:lvl>
   </w:abstractNum>
-  <w:abstractNum w:abstractNumId="11" w15:restartNumberingAfterBreak="0">
-    <w:nsid w:val="0AFF116E"/>
+  <w:abstractNum w:abstractNumId="14" w15:restartNumberingAfterBreak="0">
+    <w:nsid w:val="3DCB5BB0"/>
     <w:multiLevelType w:val="singleLevel"/>
-    <w:tmpl w:val="CE9CD03C"/>
+    <w:tmpl w:val="93F489D6"/>
+    <w:lvl w:ilvl="0">
+      <w:start w:val="5"/>
+      <w:numFmt w:val="decimal"/>
+      <w:lvlText w:val="%1."/>
+      <w:lvlJc w:val="left"/>
+      <w:pPr>
+        <w:tabs>
+          <w:tab w:val="num" w:pos="540"/>
+        </w:tabs>
+        <w:ind w:left="540" w:hanging="270"/>
+      </w:pPr>
+    </w:lvl>
+  </w:abstractNum>
+  <w:abstractNum w:abstractNumId="15" w15:restartNumberingAfterBreak="0">
+    <w:nsid w:val="433D503A"/>
+    <w:multiLevelType w:val="singleLevel"/>
+    <w:tmpl w:val="F80A39E8"/>
     <w:lvl w:ilvl="0">
       <w:start w:val="8"/>
       <w:numFmt w:val="decimal"/>
@@ -13261,10 +13419,27 @@
       </w:pPr>
     </w:lvl>
   </w:abstractNum>
-  <w:abstractNum w:abstractNumId="12" w15:restartNumberingAfterBreak="0">
-    <w:nsid w:val="1D864F0F"/>
+  <w:abstractNum w:abstractNumId="16" w15:restartNumberingAfterBreak="0">
+    <w:nsid w:val="435E2171"/>
     <w:multiLevelType w:val="singleLevel"/>
-    <w:tmpl w:val="7B3E9218"/>
+    <w:tmpl w:val="2EFE18A4"/>
+    <w:lvl w:ilvl="0">
+      <w:start w:val="1"/>
+      <w:numFmt w:val="decimal"/>
+      <w:lvlText w:val="%1."/>
+      <w:lvlJc w:val="left"/>
+      <w:pPr>
+        <w:tabs>
+          <w:tab w:val="num" w:pos="540"/>
+        </w:tabs>
+        <w:ind w:left="540" w:hanging="270"/>
+      </w:pPr>
+    </w:lvl>
+  </w:abstractNum>
+  <w:abstractNum w:abstractNumId="17" w15:restartNumberingAfterBreak="0">
+    <w:nsid w:val="492C5E6B"/>
+    <w:multiLevelType w:val="singleLevel"/>
+    <w:tmpl w:val="E78C7056"/>
     <w:lvl w:ilvl="0">
       <w:start w:val="1"/>
       <w:numFmt w:val="bullet"/>
@@ -13278,10 +13453,44 @@
       </w:pPr>
     </w:lvl>
   </w:abstractNum>
-  <w:abstractNum w:abstractNumId="13" w15:restartNumberingAfterBreak="0">
-    <w:nsid w:val="1DEA3EC0"/>
+  <w:abstractNum w:abstractNumId="18" w15:restartNumberingAfterBreak="0">
+    <w:nsid w:val="67642EDE"/>
     <w:multiLevelType w:val="singleLevel"/>
-    <w:tmpl w:val="0E925032"/>
+    <w:tmpl w:val="7D40A294"/>
+    <w:lvl w:ilvl="0">
+      <w:start w:val="1"/>
+      <w:numFmt w:val="bullet"/>
+      <w:lvlText w:val="•"/>
+      <w:lvlJc w:val="left"/>
+      <w:pPr>
+        <w:tabs>
+          <w:tab w:val="num" w:pos="540"/>
+        </w:tabs>
+        <w:ind w:left="540" w:hanging="270"/>
+      </w:pPr>
+    </w:lvl>
+  </w:abstractNum>
+  <w:abstractNum w:abstractNumId="19" w15:restartNumberingAfterBreak="0">
+    <w:nsid w:val="70AE2342"/>
+    <w:multiLevelType w:val="singleLevel"/>
+    <w:tmpl w:val="AB7C1E64"/>
+    <w:lvl w:ilvl="0">
+      <w:start w:val="1"/>
+      <w:numFmt w:val="bullet"/>
+      <w:lvlText w:val="•"/>
+      <w:lvlJc w:val="left"/>
+      <w:pPr>
+        <w:tabs>
+          <w:tab w:val="num" w:pos="540"/>
+        </w:tabs>
+        <w:ind w:left="540" w:hanging="270"/>
+      </w:pPr>
+    </w:lvl>
+  </w:abstractNum>
+  <w:abstractNum w:abstractNumId="20" w15:restartNumberingAfterBreak="0">
+    <w:nsid w:val="7460493E"/>
+    <w:multiLevelType w:val="singleLevel"/>
+    <w:tmpl w:val="4336C106"/>
     <w:lvl w:ilvl="0">
       <w:start w:val="10"/>
       <w:numFmt w:val="decimal"/>
@@ -13295,129 +13504,10 @@
       </w:pPr>
     </w:lvl>
   </w:abstractNum>
-  <w:abstractNum w:abstractNumId="14" w15:restartNumberingAfterBreak="0">
-    <w:nsid w:val="2BED4D8F"/>
+  <w:abstractNum w:abstractNumId="21" w15:restartNumberingAfterBreak="0">
+    <w:nsid w:val="78E2529A"/>
     <w:multiLevelType w:val="singleLevel"/>
-    <w:tmpl w:val="5FEA1FEC"/>
-    <w:lvl w:ilvl="0">
-      <w:start w:val="1"/>
-      <w:numFmt w:val="bullet"/>
-      <w:lvlText w:val="•"/>
-      <w:lvlJc w:val="left"/>
-      <w:pPr>
-        <w:tabs>
-          <w:tab w:val="num" w:pos="540"/>
-        </w:tabs>
-        <w:ind w:left="540" w:hanging="270"/>
-      </w:pPr>
-    </w:lvl>
-  </w:abstractNum>
-  <w:abstractNum w:abstractNumId="15" w15:restartNumberingAfterBreak="0">
-    <w:nsid w:val="44867C37"/>
-    <w:multiLevelType w:val="singleLevel"/>
-    <w:tmpl w:val="5914C284"/>
-    <w:lvl w:ilvl="0">
-      <w:start w:val="1"/>
-      <w:numFmt w:val="bullet"/>
-      <w:lvlText w:val="•"/>
-      <w:lvlJc w:val="left"/>
-      <w:pPr>
-        <w:tabs>
-          <w:tab w:val="num" w:pos="540"/>
-        </w:tabs>
-        <w:ind w:left="540" w:hanging="270"/>
-      </w:pPr>
-    </w:lvl>
-  </w:abstractNum>
-  <w:abstractNum w:abstractNumId="16" w15:restartNumberingAfterBreak="0">
-    <w:nsid w:val="52D7512E"/>
-    <w:multiLevelType w:val="singleLevel"/>
-    <w:tmpl w:val="1AEC1606"/>
-    <w:lvl w:ilvl="0">
-      <w:start w:val="1"/>
-      <w:numFmt w:val="bullet"/>
-      <w:lvlText w:val="•"/>
-      <w:lvlJc w:val="left"/>
-      <w:pPr>
-        <w:tabs>
-          <w:tab w:val="num" w:pos="540"/>
-        </w:tabs>
-        <w:ind w:left="540" w:hanging="270"/>
-      </w:pPr>
-    </w:lvl>
-  </w:abstractNum>
-  <w:abstractNum w:abstractNumId="17" w15:restartNumberingAfterBreak="0">
-    <w:nsid w:val="55D04A5A"/>
-    <w:multiLevelType w:val="singleLevel"/>
-    <w:tmpl w:val="61DC8FBE"/>
-    <w:lvl w:ilvl="0">
-      <w:start w:val="5"/>
-      <w:numFmt w:val="decimal"/>
-      <w:lvlText w:val="%1."/>
-      <w:lvlJc w:val="left"/>
-      <w:pPr>
-        <w:tabs>
-          <w:tab w:val="num" w:pos="540"/>
-        </w:tabs>
-        <w:ind w:left="540" w:hanging="270"/>
-      </w:pPr>
-    </w:lvl>
-  </w:abstractNum>
-  <w:abstractNum w:abstractNumId="18" w15:restartNumberingAfterBreak="0">
-    <w:nsid w:val="644F01DE"/>
-    <w:multiLevelType w:val="singleLevel"/>
-    <w:tmpl w:val="7D2C7724"/>
-    <w:lvl w:ilvl="0">
-      <w:start w:val="1"/>
-      <w:numFmt w:val="decimal"/>
-      <w:lvlText w:val="%1."/>
-      <w:lvlJc w:val="left"/>
-      <w:pPr>
-        <w:tabs>
-          <w:tab w:val="num" w:pos="540"/>
-        </w:tabs>
-        <w:ind w:left="540" w:hanging="270"/>
-      </w:pPr>
-    </w:lvl>
-  </w:abstractNum>
-  <w:abstractNum w:abstractNumId="19" w15:restartNumberingAfterBreak="0">
-    <w:nsid w:val="75A5131C"/>
-    <w:multiLevelType w:val="singleLevel"/>
-    <w:tmpl w:val="BB4CC81E"/>
-    <w:lvl w:ilvl="0">
-      <w:start w:val="1"/>
-      <w:numFmt w:val="bullet"/>
-      <w:lvlText w:val="•"/>
-      <w:lvlJc w:val="left"/>
-      <w:pPr>
-        <w:tabs>
-          <w:tab w:val="num" w:pos="540"/>
-        </w:tabs>
-        <w:ind w:left="540" w:hanging="270"/>
-      </w:pPr>
-    </w:lvl>
-  </w:abstractNum>
-  <w:abstractNum w:abstractNumId="20" w15:restartNumberingAfterBreak="0">
-    <w:nsid w:val="76706859"/>
-    <w:multiLevelType w:val="singleLevel"/>
-    <w:tmpl w:val="BE0C897C"/>
-    <w:lvl w:ilvl="0">
-      <w:start w:val="1"/>
-      <w:numFmt w:val="bullet"/>
-      <w:lvlText w:val="•"/>
-      <w:lvlJc w:val="left"/>
-      <w:pPr>
-        <w:tabs>
-          <w:tab w:val="num" w:pos="540"/>
-        </w:tabs>
-        <w:ind w:left="540" w:hanging="270"/>
-      </w:pPr>
-    </w:lvl>
-  </w:abstractNum>
-  <w:abstractNum w:abstractNumId="21" w15:restartNumberingAfterBreak="0">
-    <w:nsid w:val="7902010D"/>
-    <w:multiLevelType w:val="singleLevel"/>
-    <w:tmpl w:val="F4A87FA2"/>
+    <w:tmpl w:val="35546788"/>
     <w:lvl w:ilvl="0">
       <w:start w:val="1"/>
       <w:numFmt w:val="bullet"/>
@@ -13432,7 +13522,7 @@
       </w:pPr>
     </w:lvl>
   </w:abstractNum>
-  <w:num w:numId="1" w16cid:durableId="1345061196">
+  <w:num w:numId="1" w16cid:durableId="1480879673">
     <w:abstractNumId w:val="21"/>
   </w:num>
 </w:numbering>
@@ -24968,7 +25058,7 @@
     <w:autoRedefine/>
     <w:uiPriority w:val="39"/>
     <w:unhideWhenUsed/>
-    <w:rsid w:val="004D637D"/>
+    <w:rsid w:val="00B85270"/>
     <w:pPr>
       <w:spacing w:after="100"/>
     </w:pPr>
@@ -24978,7 +25068,7 @@
     <w:basedOn w:val="Fuentedeprrafopredeter"/>
     <w:uiPriority w:val="99"/>
     <w:unhideWhenUsed/>
-    <w:rsid w:val="004D637D"/>
+    <w:rsid w:val="00B85270"/>
     <w:rPr>
       <w:color w:val="0000FF" w:themeColor="hyperlink"/>
       <w:u w:val="single"/>

</xml_diff>